<commit_message>
Add documentation for AI Receipt Scanner
- Create developer guide PDF for internal use.
- Add CSS styles for document formatting.
- Implement system documentation in HTML format.
- Generate PDF version of system documentation for distribution.
</commit_message>
<xml_diff>
--- a/RELEASE_NOTES.docx
+++ b/RELEASE_NOTES.docx
@@ -47,6 +47,313 @@
           <w:color w:val="4C434E"/>
         </w:rPr>
         <w:t xml:space="preserve">Release Notes — internal expense processing app</w:t>
+      </w:r>
+    </w:p>
+    <w:p>
+      <w:pPr/>
+      <w:r>
+        <w:rPr>
+          <w:rFonts w:ascii="Helvetica" w:hAnsi="Helvetica" w:cs="Helvetica"/>
+          <w:sz w:val="29"/>
+          <w:sz-cs w:val="29"/>
+          <w:spacing w:val="0"/>
+          <w:color w:val="6D6D6D"/>
+        </w:rPr>
+        <w:t xml:space="preserve"/>
+      </w:r>
+    </w:p>
+    <w:p>
+      <w:pPr>
+        <w:spacing w:after="53"/>
+      </w:pPr>
+      <w:r>
+        <w:rPr>
+          <w:rFonts w:ascii="Helvetica" w:hAnsi="Helvetica" w:cs="Helvetica"/>
+          <w:sz w:val="40"/>
+          <w:sz-cs w:val="40"/>
+          <w:b/>
+          <w:spacing w:val="0"/>
+          <w:color w:val="FE5001"/>
+        </w:rPr>
+        <w:t xml:space="preserve">20 August 2026</w:t>
+      </w:r>
+    </w:p>
+    <w:p>
+      <w:pPr>
+        <w:spacing w:after="320"/>
+      </w:pPr>
+      <w:r>
+        <w:rPr>
+          <w:rFonts w:ascii="Helvetica" w:hAnsi="Helvetica" w:cs="Helvetica"/>
+          <w:sz w:val="25"/>
+          <w:sz-cs w:val="25"/>
+          <w:spacing w:val="0"/>
+          <w:color w:val="4C434E"/>
+        </w:rPr>
+        <w:t xml:space="preserve">App version 1.0.0 · Android · Update channel: main</w:t>
+      </w:r>
+    </w:p>
+    <w:p>
+      <w:pPr>
+        <w:spacing w:after="160"/>
+      </w:pPr>
+      <w:r>
+        <w:rPr>
+          <w:rFonts w:ascii="Helvetica" w:hAnsi="Helvetica" w:cs="Helvetica"/>
+          <w:sz w:val="32"/>
+          <w:sz-cs w:val="32"/>
+          <w:b/>
+          <w:spacing w:val="0"/>
+          <w:color w:val="1A0E1C"/>
+        </w:rPr>
+        <w:t xml:space="preserve">New Features</w:t>
+      </w:r>
+    </w:p>
+    <w:p>
+      <w:pPr>
+        <w:ind w:left="720" w:first-line="-720"/>
+      </w:pPr>
+      <w:r>
+        <w:rPr>
+          <w:rFonts w:ascii="Helvetica" w:hAnsi="Helvetica" w:cs="Helvetica"/>
+          <w:sz w:val="29"/>
+          <w:sz-cs w:val="29"/>
+          <w:color w:val="1A0E1C"/>
+        </w:rPr>
+        <w:t xml:space="preserve"/>
+        <w:tab/>
+        <w:t xml:space="preserve">•</w:t>
+        <w:tab/>
+        <w:t xml:space="preserve"/>
+      </w:r>
+      <w:r>
+        <w:rPr>
+          <w:rFonts w:ascii="Helvetica" w:hAnsi="Helvetica" w:cs="Helvetica"/>
+          <w:sz w:val="29"/>
+          <w:sz-cs w:val="29"/>
+          <w:spacing w:val="0"/>
+          <w:color w:val="1A0E1C"/>
+        </w:rPr>
+        <w:t xml:space="preserve">Receipt photos are now shared along with the receipt, so a scan taken on one phone can be opened and read on every other phone. Previously a colleague’s receipt arrived with a blank thumbnail and no way to check it.</w:t>
+      </w:r>
+    </w:p>
+    <w:p>
+      <w:pPr>
+        <w:spacing w:after="160"/>
+      </w:pPr>
+      <w:r>
+        <w:rPr>
+          <w:rFonts w:ascii="Helvetica" w:hAnsi="Helvetica" w:cs="Helvetica"/>
+          <w:sz w:val="32"/>
+          <w:sz-cs w:val="32"/>
+          <w:b/>
+          <w:spacing w:val="0"/>
+          <w:color w:val="1A0E1C"/>
+        </w:rPr>
+        <w:t xml:space="preserve">Technical</w:t>
+      </w:r>
+    </w:p>
+    <w:p>
+      <w:pPr>
+        <w:ind w:left="720" w:first-line="-720"/>
+      </w:pPr>
+      <w:r>
+        <w:rPr>
+          <w:rFonts w:ascii="Helvetica" w:hAnsi="Helvetica" w:cs="Helvetica"/>
+          <w:sz w:val="29"/>
+          <w:sz-cs w:val="29"/>
+          <w:color w:val="1A0E1C"/>
+        </w:rPr>
+        <w:t xml:space="preserve"/>
+        <w:tab/>
+        <w:t xml:space="preserve">•</w:t>
+        <w:tab/>
+        <w:t xml:space="preserve"/>
+      </w:r>
+      <w:r>
+        <w:rPr>
+          <w:rFonts w:ascii="Helvetica" w:hAnsi="Helvetica" w:cs="Helvetica"/>
+          <w:sz w:val="29"/>
+          <w:sz-cs w:val="29"/>
+          <w:spacing w:val="0"/>
+          <w:color w:val="1A0E1C"/>
+        </w:rPr>
+        <w:t xml:space="preserve">Photos are uploaded to a private Supabase Storage bucket (</w:t>
+      </w:r>
+      <w:r>
+        <w:rPr>
+          <w:rFonts w:ascii="Helvetica" w:hAnsi="Helvetica" w:cs="Helvetica"/>
+          <w:sz w:val="29"/>
+          <w:sz-cs w:val="29"/>
+          <w:i/>
+          <w:spacing w:val="0"/>
+          <w:color w:val="1A0E1C"/>
+        </w:rPr>
+        <w:t xml:space="preserve">receipt-images</w:t>
+      </w:r>
+      <w:r>
+        <w:rPr>
+          <w:rFonts w:ascii="Helvetica" w:hAnsi="Helvetica" w:cs="Helvetica"/>
+          <w:sz w:val="29"/>
+          <w:sz-cs w:val="29"/>
+          <w:spacing w:val="0"/>
+          <w:color w:val="1A0E1C"/>
+        </w:rPr>
+        <w:t xml:space="preserve">) over the same REST path as the records, with read access through the app key only — receipt IDs contain a timestamp, so a public link would be partly guessable.</w:t>
+      </w:r>
+    </w:p>
+    <w:p>
+      <w:pPr>
+        <w:ind w:left="720" w:first-line="-720"/>
+      </w:pPr>
+      <w:r>
+        <w:rPr>
+          <w:rFonts w:ascii="Helvetica" w:hAnsi="Helvetica" w:cs="Helvetica"/>
+          <w:sz w:val="29"/>
+          <w:sz-cs w:val="29"/>
+          <w:color w:val="1A0E1C"/>
+        </w:rPr>
+        <w:t xml:space="preserve"/>
+        <w:tab/>
+        <w:t xml:space="preserve">•</w:t>
+        <w:tab/>
+        <w:t xml:space="preserve"/>
+      </w:r>
+      <w:r>
+        <w:rPr>
+          <w:rFonts w:ascii="Helvetica" w:hAnsi="Helvetica" w:cs="Helvetica"/>
+          <w:sz w:val="29"/>
+          <w:sz-cs w:val="29"/>
+          <w:spacing w:val="0"/>
+          <w:color w:val="1A0E1C"/>
+        </w:rPr>
+        <w:t xml:space="preserve">Each photo is resized before upload, keeping a receipt around 250 KB instead of a 2–4 MB camera frame, so the free storage tier holds thousands of receipts rather than a few hundred.</w:t>
+      </w:r>
+    </w:p>
+    <w:p>
+      <w:pPr>
+        <w:ind w:left="720" w:first-line="-720"/>
+      </w:pPr>
+      <w:r>
+        <w:rPr>
+          <w:rFonts w:ascii="Helvetica" w:hAnsi="Helvetica" w:cs="Helvetica"/>
+          <w:sz w:val="29"/>
+          <w:sz-cs w:val="29"/>
+          <w:color w:val="1A0E1C"/>
+        </w:rPr>
+        <w:t xml:space="preserve"/>
+        <w:tab/>
+        <w:t xml:space="preserve">•</w:t>
+        <w:tab/>
+        <w:t xml:space="preserve"/>
+      </w:r>
+      <w:r>
+        <w:rPr>
+          <w:rFonts w:ascii="Helvetica" w:hAnsi="Helvetica" w:cs="Helvetica"/>
+          <w:sz w:val="29"/>
+          <w:sz-cs w:val="29"/>
+          <w:spacing w:val="0"/>
+          <w:color w:val="1A0E1C"/>
+        </w:rPr>
+        <w:t xml:space="preserve">A photo that fails to upload never holds back the receipt itself; the record still reaches the database and Settings → Re-upload all receipts sends the photo later.</w:t>
+      </w:r>
+    </w:p>
+    <w:p>
+      <w:pPr>
+        <w:ind w:left="720" w:first-line="-720"/>
+      </w:pPr>
+      <w:r>
+        <w:rPr>
+          <w:rFonts w:ascii="Helvetica" w:hAnsi="Helvetica" w:cs="Helvetica"/>
+          <w:sz w:val="29"/>
+          <w:sz-cs w:val="29"/>
+          <w:color w:val="1A0E1C"/>
+        </w:rPr>
+        <w:t xml:space="preserve"/>
+        <w:tab/>
+        <w:t xml:space="preserve">•</w:t>
+        <w:tab/>
+        <w:t xml:space="preserve"/>
+      </w:r>
+      <w:r>
+        <w:rPr>
+          <w:rFonts w:ascii="Helvetica" w:hAnsi="Helvetica" w:cs="Helvetica"/>
+          <w:sz w:val="29"/>
+          <w:sz-cs w:val="29"/>
+          <w:spacing w:val="0"/>
+          <w:color w:val="1A0E1C"/>
+        </w:rPr>
+        <w:t xml:space="preserve">Requires the updated </w:t>
+      </w:r>
+      <w:r>
+        <w:rPr>
+          <w:rFonts w:ascii="Helvetica" w:hAnsi="Helvetica" w:cs="Helvetica"/>
+          <w:sz w:val="29"/>
+          <w:sz-cs w:val="29"/>
+          <w:i/>
+          <w:spacing w:val="0"/>
+          <w:color w:val="1A0E1C"/>
+        </w:rPr>
+        <w:t xml:space="preserve">supabase/schema.sql</w:t>
+      </w:r>
+      <w:r>
+        <w:rPr>
+          <w:rFonts w:ascii="Helvetica" w:hAnsi="Helvetica" w:cs="Helvetica"/>
+          <w:sz w:val="29"/>
+          <w:sz-cs w:val="29"/>
+          <w:spacing w:val="0"/>
+          <w:color w:val="1A0E1C"/>
+        </w:rPr>
+        <w:t xml:space="preserve"> (adds the </w:t>
+      </w:r>
+      <w:r>
+        <w:rPr>
+          <w:rFonts w:ascii="Helvetica" w:hAnsi="Helvetica" w:cs="Helvetica"/>
+          <w:sz w:val="29"/>
+          <w:sz-cs w:val="29"/>
+          <w:i/>
+          <w:spacing w:val="0"/>
+          <w:color w:val="1A0E1C"/>
+        </w:rPr>
+        <w:t xml:space="preserve">image_path</w:t>
+      </w:r>
+      <w:r>
+        <w:rPr>
+          <w:rFonts w:ascii="Helvetica" w:hAnsi="Helvetica" w:cs="Helvetica"/>
+          <w:sz w:val="29"/>
+          <w:sz-cs w:val="29"/>
+          <w:spacing w:val="0"/>
+          <w:color w:val="1A0E1C"/>
+        </w:rPr>
+        <w:t xml:space="preserve"> column and the storage bucket) to be applied before the app update is published.</w:t>
+      </w:r>
+    </w:p>
+    <w:p>
+      <w:pPr>
+        <w:ind w:left="720" w:first-line="-720"/>
+      </w:pPr>
+      <w:r>
+        <w:rPr>
+          <w:rFonts w:ascii="Helvetica" w:hAnsi="Helvetica" w:cs="Helvetica"/>
+          <w:sz w:val="29"/>
+          <w:sz-cs w:val="29"/>
+          <w:color w:val="1A0E1C"/>
+        </w:rPr>
+        <w:t xml:space="preserve"/>
+        <w:tab/>
+        <w:t xml:space="preserve">•</w:t>
+        <w:tab/>
+        <w:t xml:space="preserve"/>
+      </w:r>
+      <w:r>
+        <w:rPr>
+          <w:rFonts w:ascii="Helvetica" w:hAnsi="Helvetica" w:cs="Helvetica"/>
+          <w:sz w:val="29"/>
+          <w:sz-cs w:val="29"/>
+          <w:spacing w:val="0"/>
+          <w:color w:val="1A0E1C"/>
+        </w:rPr>
+        <w:t xml:space="preserve">Test suite now at 96 tests.</w:t>
       </w:r>
     </w:p>
     <w:p>

</xml_diff>

<commit_message>
feat: update maintenance and documentation for AI model swapping and arithmetic validation
</commit_message>
<xml_diff>
--- a/RELEASE_NOTES.docx
+++ b/RELEASE_NOTES.docx
@@ -188,6 +188,34 @@
           <w:spacing w:val="0"/>
           <w:color w:val="1A0E1C"/>
         </w:rPr>
+        <w:t xml:space="preserve">Receipt amounts are now checked against each other before a scan is accepted — the line items must add up to the subtotal, and the subtotal plus tax to the total. When they do not, the receipt is read a second time by a stronger AI model, and anything still not adding up is flagged on the receipt with a note saying which figures disagree. Handwritten amounts that were read wrongly used to pass into the monthly sheet unnoticed.</w:t>
+      </w:r>
+    </w:p>
+    <w:p>
+      <w:pPr>
+        <w:ind w:left="720" w:first-line="-720"/>
+      </w:pPr>
+      <w:r>
+        <w:rPr>
+          <w:rFonts w:ascii="Helvetica" w:hAnsi="Helvetica" w:cs="Helvetica"/>
+          <w:sz w:val="29"/>
+          <w:sz-cs w:val="29"/>
+          <w:color w:val="1A0E1C"/>
+        </w:rPr>
+        <w:t xml:space="preserve"/>
+        <w:tab/>
+        <w:t xml:space="preserve">•</w:t>
+        <w:tab/>
+        <w:t xml:space="preserve"/>
+      </w:r>
+      <w:r>
+        <w:rPr>
+          <w:rFonts w:ascii="Helvetica" w:hAnsi="Helvetica" w:cs="Helvetica"/>
+          <w:sz w:val="29"/>
+          <w:sz-cs w:val="29"/>
+          <w:spacing w:val="0"/>
+          <w:color w:val="1A0E1C"/>
+        </w:rPr>
         <w:t xml:space="preserve">An exported sheet can now be saved directly into a folder on the phone — Downloads, Google Drive, an SD card — instead of only being passed on through the share sheet. Every export now asks </w:t>
       </w:r>
       <w:r>
@@ -589,7 +617,35 @@
           <w:spacing w:val="0"/>
           <w:color w:val="1A0E1C"/>
         </w:rPr>
-        <w:t xml:space="preserve">Test suite now at 100 tests.</w:t>
+        <w:t xml:space="preserve">A failed scan is now re-read by a different, stronger model rather than by asking the same one again — a model that misreads a digit gives the same answer the second time. Only receipts that fail the first reading cost the higher price, roughly four times a normal scan.</w:t>
+      </w:r>
+    </w:p>
+    <w:p>
+      <w:pPr>
+        <w:ind w:left="720" w:first-line="-720"/>
+      </w:pPr>
+      <w:r>
+        <w:rPr>
+          <w:rFonts w:ascii="Helvetica" w:hAnsi="Helvetica" w:cs="Helvetica"/>
+          <w:sz w:val="29"/>
+          <w:sz-cs w:val="29"/>
+          <w:color w:val="1A0E1C"/>
+        </w:rPr>
+        <w:t xml:space="preserve"/>
+        <w:tab/>
+        <w:t xml:space="preserve">•</w:t>
+        <w:tab/>
+        <w:t xml:space="preserve"/>
+      </w:r>
+      <w:r>
+        <w:rPr>
+          <w:rFonts w:ascii="Helvetica" w:hAnsi="Helvetica" w:cs="Helvetica"/>
+          <w:sz w:val="29"/>
+          <w:sz-cs w:val="29"/>
+          <w:spacing w:val="0"/>
+          <w:color w:val="1A0E1C"/>
+        </w:rPr>
+        <w:t xml:space="preserve">Test suite now at 113 tests.</w:t>
       </w:r>
     </w:p>
     <w:p>

</xml_diff>